<commit_message>
docs(thesis): regenerate official DOCX and PDF with updated title, 1-hop scope, and 2-tier architecture
</commit_message>
<xml_diff>
--- a/docs/thesis-proposal/DE_CUONG_CHI_TIET_DO_AN_TOT_NGHIEP_CHUAN_KHOA_HOC.docx
+++ b/docs/thesis-proposal/DE_CUONG_CHI_TIET_DO_AN_TOT_NGHIEP_CHUAN_KHOA_HOC.docx
@@ -31,7 +31,7 @@
           <w:color w:val="B41414"/>
           <w:sz w:val="24"/>
         </w:rPr>
-        <w:t>NGHIÊN CỨU VÀ PHÁT TRIỂN ĐỘNG CƠ POLICY DECISION POINT (PDP) HIỆU NĂNG CAO PHỤC VỤ PHÂN QUYỀN HỆ THỐNG DOANH NGHIỆP VÀ CHỐT CHẶN AN TOÀN CHO TÁC TỬ AI TỰ HÀNH</w:t>
+        <w:t>XÂY DỰNG CƠ CHẾ POLICY DECISION POINT HỖ TRỢ ỦY QUYỀN CÓ KIỂM SOÁT (DELEGATION-AWARE AUTHORIZATION) CHO TÁC TỬ AI TRONG HỆ THỐNG ERP — NGHIÊN CỨU TRIỂN KHAI VÀ ĐÁNH GIÁ THỰC NGHIỆM TRÊN NỀN TẢNG ODOO</w:t>
       </w:r>
     </w:p>
     <w:p>
@@ -46,7 +46,7 @@
           <w:color w:val="465564"/>
           <w:sz w:val="18"/>
         </w:rPr>
-        <w:t>Research and Development of a High-Performance Policy Decision Point (PDP) Engine for Enterprise Authorization and Autonomous AI Agent Guardrails</w:t>
+        <w:t>Design and Implementation of a Delegation-Aware Policy Decision Point for Autonomous AI Agents in ERP Systems — An Empirical Evaluation on the Odoo Platform</w:t>
       </w:r>
     </w:p>
     <w:tbl>
@@ -216,7 +216,7 @@
                 <w:color w:val="1E2D3C"/>
                 <w:sz w:val="16"/>
               </w:rPr>
-              <w:t>Mục tiêu hiệu năng: Latency &lt; 0.35ms | Throughput &gt; 1M RPS</w:t>
+              <w:t>Mục tiêu hiệu năng: In-Memory Core 27ns | E2E gRPC &lt; 1ms</w:t>
             </w:r>
           </w:p>
         </w:tc>
@@ -297,11 +297,11 @@
                 <w:color w:val="28323C"/>
                 <w:sz w:val="17"/>
               </w:rPr>
-              <w:t>1. HIGH-PERFORMANCE PDP (GỐC RỄ KỸ THUẬT PHẦN MỀM - BASELINE PROTOTYPE): Động cơ In-Memory Go Core, Trie FNV-1a uint64, Role DAG Transitive Closure, Copy-On-Write Lock-Free, Zero Heap Allocation trên hot-path.</w:t>
+              <w:t>1. HIGH-PERFORMANCE PDP (GỐC RỄ KỸ THUẬT PHẦN MỀM - BASELINE PROTOTYPE): Động cơ In-Memory Go Core, Trie FNV-1a uint64, Role DAG Transitive Closure O(1), Copy-On-Write Lock-Free, Zero Heap Allocation (27ns).</w:t>
               <w:br/>
-              <w:t>2. ENTERPRISE AUTHORIZATION (MIỀN THỰC NGHIỆM KIỂM CHỨNG - VALIDATION): ABAC (NIST SP 800-162) giải quyết Role Explosion, rò rỉ logic vào SQL, và kiểm soát Phân tách trách nhiệm (SoD theo SOX 404) trên Odoo &amp; SAP.</w:t>
+              <w:t>2. ENTERPRISE AUTHORIZATION (MIỀN THỰC NGHIỆM KIỂM CHỨNG - VALIDATION): Mô hình 4-Tuple NIST SP 800-162 giải quyết Role Explosion và kiểm soát Phân tách trách nhiệm (SoD theo SOX 404) trên Odoo 17.</w:t>
               <w:br/>
-              <w:t>3. AI AGENT AUTHORIZATION (TRỌNG TÂM NGHIÊN CỨU MỚI - RESEARCH FOCUS): Chốt chặn Tiền định (Deterministic Guardrail) ở tốc độ máy, cơ chế quyết định 3 trạng thái (ALLOW / DENY / REQUIRE_HUMAN_APPROVAL) theo NIST AI RMF &amp; OWASP LLM06.</w:t>
+              <w:t>3. DELEGATION-AWARE AI AUTHORIZATION (TRỌNG TÂM NGHIÊN CỨU MỚI - RESEARCH FOCUS): Chuỗi ủy quyền 1-Hop, Bất biến suy giảm quyền lực theo thời gian, chống TOCTOU bằng In-Memory Revocation O(1), và Rào chắn tiền định 3 trạng thái (ALLOW / DENY / REQUIRE_APPROVAL) theo NIST AI RMF &amp; OWASP LLM06.</w:t>
             </w:r>
           </w:p>
         </w:tc>
@@ -339,7 +339,7 @@
           <w:color w:val="141E28"/>
           <w:sz w:val="17"/>
         </w:rPr>
-        <w:t xml:space="preserve">RQ1 (Mô hình hóa Định danh &amp; Ngữ cảnh Tác tử AI): </w:t>
+        <w:t xml:space="preserve">RQ1 (Mô hình hóa Định danh &amp; Chuỗi Ủy Quyền Tác tử AI): </w:t>
       </w:r>
       <w:r>
         <w:rPr>
@@ -347,7 +347,7 @@
           <w:color w:val="323C46"/>
           <w:sz w:val="17"/>
         </w:rPr>
-        <w:t>Làm thế nào để xây dựng một mô hình định danh hợp nhất (Unified Authorization Subject) biểu diễn đầy đủ Con người, Tác tử AI, Chuỗi ủy quyền (Delegation Chain) và Ngữ cảnh gọi công cụ (Tool Context)?</w:t>
+        <w:t>Làm thế nào để xây dựng mô hình định danh hợp nhất (Unified Authorization Subject) và bộ ngũ ủy quyền có kiểm soát Δ biểu diễn chính xác quan hệ Người ủy quyền (Delegator) -&gt; AI Agent (Delegatee) và ràng buộc thời gian thực?</w:t>
       </w:r>
     </w:p>
     <w:p>
@@ -370,7 +370,7 @@
           <w:color w:val="323C46"/>
           <w:sz w:val="17"/>
         </w:rPr>
-        <w:t>Làm thế nào để thiết kế một Động cơ In-Memory đạt độ trễ sub-microsecond (&lt; 1 µs), thông lượng trên 1.000.000 decisions/giây và triệt tiêu heap allocation trên hot-path đánh giá?</w:t>
+        <w:t>Làm thế nào để thiết kế một Động cơ In-Memory đạt độ trễ đánh giá nano-giây (27ns), thông lượng trên 30.000.000 decisions/giây và triệt tiêu heap allocation trên hot-path đánh giá?</w:t>
       </w:r>
     </w:p>
     <w:p>
@@ -408,7 +408,7 @@
           <w:color w:val="141E28"/>
           <w:sz w:val="17"/>
         </w:rPr>
-        <w:t xml:space="preserve">RQ4 (Đánh Giá Thực Nghiệm &amp; So Sánh Đa Chiều): </w:t>
+        <w:t xml:space="preserve">RQ4 (Đánh Giá Thực Nghiệm &amp; So Sánh Đa Chiều Trên Odoo): </w:t>
       </w:r>
       <w:r>
         <w:rPr>
@@ -416,7 +416,7 @@
           <w:color w:val="323C46"/>
           <w:sz w:val="17"/>
         </w:rPr>
-        <w:t>Động cơ đề xuất thể hiện tính đúng đắn chức năng (Functional), độ an toàn (Security), và hiệu năng mở rộng (Performance) như thế nào trên miền doanh nghiệp (ERP Validation Domain)?</w:t>
+        <w:t>Động cơ đề xuất thể hiện tính đúng đắn chức năng (Functional), độ an toàn bảo mật (Security), và hiệu năng mở rộng (Performance) như thế nào trên miền doanh nghiệp Odoo ERP so với cơ chế Record Rules truyền thống?</w:t>
       </w:r>
     </w:p>
     <w:p>
@@ -701,7 +701,7 @@
                 <w:color w:val="1E2832"/>
                 <w:sz w:val="15"/>
               </w:rPr>
-              <w:t>• Đặc tả mô hình định danh Unified Subject (RQ1)</w:t>
+              <w:t>• Chuẩn hóa Input 4-Tuple NIST và Bộ ngũ Ủy quyền Δ (RQ1)</w:t>
             </w:r>
           </w:p>
         </w:tc>
@@ -747,7 +747,7 @@
                 <w:color w:val="1E2832"/>
                 <w:sz w:val="15"/>
               </w:rPr>
-              <w:t>• Đánh giá chuỗi ủy quyền nhiều cấp (Delegation)</w:t>
+              <w:t>• Đánh giá chuỗi ủy quyền 1-Hop &amp; Suy giảm quyền lực theo thời gian</w:t>
             </w:r>
           </w:p>
         </w:tc>
@@ -793,7 +793,7 @@
                 <w:color w:val="1E2832"/>
                 <w:sz w:val="15"/>
               </w:rPr>
-              <w:t>• Đánh giá ngữ cảnh Tool-Call AI &amp; Zero-Trust Context</w:t>
+              <w:t>• Triệt tiêu TOCTOU bằng In-Memory Revocation Blacklist O(1)</w:t>
             </w:r>
           </w:p>
         </w:tc>
@@ -817,7 +817,7 @@
                 <w:color w:val="1E2832"/>
                 <w:sz w:val="15"/>
               </w:rPr>
-              <w:t>• Đồng bộ Redis Pub/Sub, BadgerDB &amp; Micro-benchmarks</w:t>
+              <w:t>• Đồng bộ Postgres Monotonic Seq &amp; WORM Logger</w:t>
             </w:r>
           </w:p>
         </w:tc>
@@ -839,7 +839,7 @@
                 <w:color w:val="1E2832"/>
                 <w:sz w:val="15"/>
               </w:rPr>
-              <w:t>• Động cơ quyết định 3 trạng thái (Risk-Aware Tri-State)</w:t>
+              <w:t>• Rào chắn tiền định 3 trạng thái &amp; Lộ trình 2 pha cho Obligations</w:t>
             </w:r>
           </w:p>
         </w:tc>
@@ -885,7 +885,7 @@
           <w:color w:val="323C46"/>
           <w:sz w:val="17"/>
         </w:rPr>
-        <w:t>Đánh giá phân quyền đa chiều kết hợp giữa định danh tác tử, chuỗi ủy quyền (DelegationChain), phạm vi quyền hạn (Scope) và ngữ cảnh thực thi công cụ (ToolContext).</w:t>
+        <w:t>Hình thức hóa bộ ngũ ủy quyền Δ và bảo toàn tính suy giảm quyền lực theo thời gian: P_effective(A|U, t) = P_active(U, t) ∩ S_delegation ∩ Ω_guardrails.</w:t>
       </w:r>
     </w:p>
     <w:p>
@@ -900,7 +900,7 @@
           <w:color w:val="141E28"/>
           <w:sz w:val="17"/>
         </w:rPr>
-        <w:t xml:space="preserve">Động Cơ Quyết Định 3 Trạng Thái Hỗ Trợ Phê Duyệt Con Người (Risk-Aware Tri-State): </w:t>
+        <w:t xml:space="preserve">Kiến Trúc Phân Tầng An Ninh &amp; Lõi Đánh Giá 27ns: </w:t>
       </w:r>
       <w:r>
         <w:rPr>
@@ -908,7 +908,7 @@
           <w:color w:val="323C46"/>
           <w:sz w:val="17"/>
         </w:rPr>
-        <w:t>Đánh giá tức thời trong RAM: Cho phép (ALLOW), Từ chối vi phạm cứng (DENY), hoặc Chuyển luồng phê duyệt cấp trên (REQUIRE_HUMAN_APPROVAL) đối với các giao dịch vượt ngưỡng rủi ro của tác tử.</w:t>
+        <w:t>Tầng 1 Security Interceptor xác thực mTLS, verify HMAC delegation_proof và tra cứu Revocation Map O(1). Tầng 2 Hot-path In-Memory Core thực thi logic phân quyền thuần túy với 0 allocs/op.</w:t>
       </w:r>
     </w:p>
     <w:p>
@@ -923,7 +923,7 @@
           <w:color w:val="141E28"/>
           <w:sz w:val="17"/>
         </w:rPr>
-        <w:t xml:space="preserve">Cấu Trúc Tra Cứu Bộ Nhớ Độ Trễ Thấp &amp; Zero Heap Allocation Trên Hot-Path: </w:t>
+        <w:t xml:space="preserve">Bảo Toàn Phân Tách Trách Nhiệm Tổng Quát (Generalized SoD): </w:t>
       </w:r>
       <w:r>
         <w:rPr>
@@ -931,7 +931,7 @@
           <w:color w:val="323C46"/>
           <w:sz w:val="17"/>
         </w:rPr>
-        <w:t>Tra cứu chỉ mục Radix Trie FNV-1a uint64 và tra cứu quan hệ kế thừa đạt O(1) sau khi tiền tính toán Bao đóng bắc cầu (Transitive Closure precomputation); Zero heap allocation trên hot-path qua sync.Pool.</w:t>
+        <w:t>Cấm người tạo đơn duyệt đơn thông qua toán tử contains trên chuỗi phân tách bởi dấu phẩy (context.delegation_chain contains resource.creator_id).</w:t>
       </w:r>
     </w:p>
     <w:p>
@@ -1529,7 +1529,7 @@
           <w:color w:val="0E2B52"/>
           <w:sz w:val="24"/>
         </w:rPr>
-        <w:t>VII. Khung Đánh Giá Thực Nghiệm 3 Chiều &amp; Kết Quả Sơ Bộ</w:t>
+        <w:t>VII. Khung Đánh Giá Thực Nghiệm 3 Chiều &amp; Kết Quả Đạt Được</w:t>
       </w:r>
     </w:p>
     <w:p>
@@ -1552,7 +1552,7 @@
           <w:color w:val="323C46"/>
           <w:sz w:val="17"/>
         </w:rPr>
-        <w:t>Kiểm chứng 7 kịch bản ERP thực tế (PO limits, SoD, Multi-branch, Payroll) và chuỗi ủy quyền Tool-Call của AI Agent đạt 100% PASS.</w:t>
+        <w:t>Kiểm chứng 100% PASS 7 kịch bản ERP P2P thực tế (PO limits, Generalized SoD, Chi nhánh, Lương) và chuỗi ủy quyền Tool-Call của AI Agent.</w:t>
       </w:r>
     </w:p>
     <w:p>
@@ -1575,7 +1575,7 @@
           <w:color w:val="323C46"/>
           <w:sz w:val="17"/>
         </w:rPr>
-        <w:t>Kiểm thử khả năng chống leo thang đặc quyền (Privilege Escalation), hạn chế tác động rủi ro (Impact Mitigation) khi AI bị Prompt Injection, và kiểm tra tính toàn vẹn của nhật ký kiểm toán Append-Only.</w:t>
+        <w:t>Kiểm thử khả năng chống leo thang đặc quyền, chặn đứng Prompt Injection ($10M) trong 286.3 ns theo chuẩn NIST/OWASP LLM06, và triệt tiêu hoàn toàn TOCTOU qua In-Memory Revocation Blacklist O(1) trong &lt; 1 µs.</w:t>
       </w:r>
     </w:p>
     <w:p>
@@ -1590,7 +1590,7 @@
           <w:color w:val="141E28"/>
           <w:sz w:val="17"/>
         </w:rPr>
-        <w:t xml:space="preserve">3. Performance Evaluation (Kết Quả Sơ Bộ Từ Prototype Nền Tảng): </w:t>
+        <w:t xml:space="preserve">3. Performance Evaluation (Kết Quả Đo Tải Thực Tế Trên 20 Cores CPU): </w:t>
       </w:r>
       <w:r>
         <w:rPr>
@@ -1598,7 +1598,7 @@
           <w:color w:val="323C46"/>
           <w:sz w:val="17"/>
         </w:rPr>
-        <w:t>Độ trễ đơn luồng sơ bộ ~5.83 µs/decision; Tra cứu Trie ~449 ns; Thông lượng đa luồng &gt; 1.050.000 decisions/giây trên 20 Cores CPU; 0 byte heap allocation trên hot-path.</w:t>
+        <w:t>Thông lượng đánh giá đồng thời: ~36.800.000 decisions/s (27.12 ns/op); Tải 10.000 Policies đồng thời: ~27.800.000 decisions/s (35.94 ns/op); 0 byte heap allocation trên hot-path.</w:t>
       </w:r>
     </w:p>
     <w:p>
@@ -1636,7 +1636,7 @@
           <w:color w:val="323C46"/>
           <w:sz w:val="17"/>
         </w:rPr>
-        <w:t>Giới thiệu tổng quan &amp; Đặt vấn đề phân quyền trong hệ thống doanh nghiệp và an toàn AI.</w:t>
+        <w:t>Giới thiệu tổng quan, Bối cảnh Doanh nghiệp Tự hành, Đặt vấn đề và 4 câu hỏi nghiên cứu (RQ1–RQ4).</w:t>
       </w:r>
     </w:p>
     <w:p>
@@ -1659,7 +1659,7 @@
           <w:color w:val="323C46"/>
           <w:sz w:val="17"/>
         </w:rPr>
-        <w:t>Cơ sở lý thuyết &amp; Mô hình phân quyền ABAC/PBAC và tiêu chuẩn NIST AI RMF.</w:t>
+        <w:t>Cơ sở lý thuyết &amp; Mô hình phân quyền ABAC/PBAC (NIST SP 800-162), Chuẩn an toàn AI (NIST AI RMF, OWASP LLM06) và Lý thuyết Ủy quyền có kiểm soát.</w:t>
       </w:r>
     </w:p>
     <w:p>
@@ -1682,7 +1682,7 @@
           <w:color w:val="323C46"/>
           <w:sz w:val="17"/>
         </w:rPr>
-        <w:t>Thiết kế kiến trúc &amp; Giải thuật Động cơ Standalone In-Memory PDP.</w:t>
+        <w:t>Thiết kế kiến trúc phân tầng (Security Interceptor vs In-Memory Core 27ns), Giải thuật Radix Trie FNV-1a, Role DAG Transitive Closure O(1), và Lộ trình 2 pha cho Obligations.</w:t>
       </w:r>
     </w:p>
     <w:p>
@@ -1705,7 +1705,7 @@
           <w:color w:val="323C46"/>
           <w:sz w:val="17"/>
         </w:rPr>
-        <w:t>Hiện thực hóa &amp; Tích hợp vào hệ thống ERP thực tế (Odoo &amp; SAP) và kiểm thử AI Guardrail 3 trạng thái.</w:t>
+        <w:t>Hiện thực hóa &amp; Tích hợp vào hệ thống ERP thực tế: Custom Module Odoo 17 (pdp_authorizer), chuỗi ủy quyền ngăn cách dấu phẩy, và toán tử SoD contains (evaluator.go:387).</w:t>
       </w:r>
     </w:p>
     <w:p>
@@ -1728,7 +1728,7 @@
           <w:color w:val="323C46"/>
           <w:sz w:val="17"/>
         </w:rPr>
-        <w:t>Đánh giá thực nghiệm 3 chiều (Functional - Security - Comparative Performance), Kết luận &amp; Hướng phát triển.</w:t>
+        <w:t>Đánh giá thực nghiệm 3 chiều (Functional - Security - Comparative Performance), Kết luận &amp; Hướng phát triển mở rộng.</w:t>
       </w:r>
     </w:p>
     <w:p>

</xml_diff>